<commit_message>
modified:   README.md 	modified:   sources/requirements.json 	modified:   sources/settings.json 	deleted:    sources/sig.txt 	modified:   sources/skeleton.docx 	modified:   warrantBuilder.py
</commit_message>
<xml_diff>
--- a/sources/skeleton.docx
+++ b/sources/skeleton.docx
@@ -107,10 +107,10 @@
                 <w:szCs w:val="28"/>
               </w:rPr>
               <w:drawing>
-                <wp:inline distT="0" distB="0" distL="0" distR="0" wp14:anchorId="587EA2F1" wp14:editId="755E3313">
-                  <wp:extent cx="687545" cy="1057762"/>
-                  <wp:effectExtent l="0" t="0" r="0" b="0"/>
-                  <wp:docPr id="1933397000" name="Picture 1"/>
+                <wp:inline distT="0" distB="0" distL="0" distR="0" wp14:anchorId="587EA2F1" wp14:editId="30E05A07">
+                  <wp:extent cx="687545" cy="834719"/>
+                  <wp:effectExtent l="0" t="0" r="0" b="3810"/>
+                  <wp:docPr id="1933397000" name="Picture 1" descr="Blank wood plaque"/>
                   <wp:cNvGraphicFramePr>
                     <a:graphicFrameLocks xmlns:a="http://schemas.openxmlformats.org/drawingml/2006/main" noChangeAspect="1"/>
                   </wp:cNvGraphicFramePr>
@@ -118,7 +118,7 @@
                     <a:graphicData uri="http://schemas.openxmlformats.org/drawingml/2006/picture">
                       <pic:pic xmlns:pic="http://schemas.openxmlformats.org/drawingml/2006/picture">
                         <pic:nvPicPr>
-                          <pic:cNvPr id="1933397000" name="Picture 1"/>
+                          <pic:cNvPr id="1933397000" name="Picture 1" descr="Blank wood plaque"/>
                           <pic:cNvPicPr/>
                         </pic:nvPicPr>
                         <pic:blipFill>
@@ -136,7 +136,7 @@
                         <pic:spPr>
                           <a:xfrm>
                             <a:off x="0" y="0"/>
-                            <a:ext cx="687545" cy="1057762"/>
+                            <a:ext cx="687545" cy="834719"/>
                           </a:xfrm>
                           <a:prstGeom prst="rect">
                             <a:avLst/>
@@ -998,10 +998,10 @@
                 <w:szCs w:val="28"/>
               </w:rPr>
               <w:drawing>
-                <wp:inline distT="0" distB="0" distL="0" distR="0" wp14:anchorId="56A67224" wp14:editId="1EC7E30D">
-                  <wp:extent cx="687545" cy="1057762"/>
-                  <wp:effectExtent l="0" t="0" r="0" b="0"/>
-                  <wp:docPr id="1434838235" name="Picture 1"/>
+                <wp:inline distT="0" distB="0" distL="0" distR="0" wp14:anchorId="56A67224" wp14:editId="37B188F8">
+                  <wp:extent cx="687545" cy="834719"/>
+                  <wp:effectExtent l="0" t="0" r="0" b="3810"/>
+                  <wp:docPr id="1434838235" name="Picture 1" descr="Blank wood plaque"/>
                   <wp:cNvGraphicFramePr>
                     <a:graphicFrameLocks xmlns:a="http://schemas.openxmlformats.org/drawingml/2006/main" noChangeAspect="1"/>
                   </wp:cNvGraphicFramePr>
@@ -1009,7 +1009,7 @@
                     <a:graphicData uri="http://schemas.openxmlformats.org/drawingml/2006/picture">
                       <pic:pic xmlns:pic="http://schemas.openxmlformats.org/drawingml/2006/picture">
                         <pic:nvPicPr>
-                          <pic:cNvPr id="1434838235" name="Picture 1"/>
+                          <pic:cNvPr id="1434838235" name="Picture 1" descr="Blank wood plaque"/>
                           <pic:cNvPicPr/>
                         </pic:nvPicPr>
                         <pic:blipFill>
@@ -1027,7 +1027,7 @@
                         <pic:spPr>
                           <a:xfrm>
                             <a:off x="0" y="0"/>
-                            <a:ext cx="687545" cy="1057762"/>
+                            <a:ext cx="687545" cy="834719"/>
                           </a:xfrm>
                           <a:prstGeom prst="rect">
                             <a:avLst/>
@@ -2482,7 +2482,29 @@
           <w:sz w:val="24"/>
           <w:szCs w:val="24"/>
         </w:rPr>
-        <w:t xml:space="preserve">Which I believe to have been committed </w:t>
+        <w:t xml:space="preserve">Which I believe </w:t>
+      </w:r>
+      <w:proofErr w:type="gramStart"/>
+      <w:r>
+        <w:rPr>
+          <w:rFonts w:ascii="Times New Roman" w:hAnsi="Times New Roman" w:cs="Times New Roman"/>
+          <w:b/>
+          <w:bCs/>
+          <w:sz w:val="24"/>
+          <w:szCs w:val="24"/>
+        </w:rPr>
+        <w:t>to have</w:t>
+      </w:r>
+      <w:proofErr w:type="gramEnd"/>
+      <w:r>
+        <w:rPr>
+          <w:rFonts w:ascii="Times New Roman" w:hAnsi="Times New Roman" w:cs="Times New Roman"/>
+          <w:b/>
+          <w:bCs/>
+          <w:sz w:val="24"/>
+          <w:szCs w:val="24"/>
+        </w:rPr>
+        <w:t xml:space="preserve"> been committed </w:t>
       </w:r>
       <w:proofErr w:type="gramStart"/>
       <w:r>
@@ -4097,10 +4119,10 @@
                 <w:szCs w:val="28"/>
               </w:rPr>
               <w:drawing>
-                <wp:inline distT="0" distB="0" distL="0" distR="0" wp14:anchorId="277EC2D7" wp14:editId="6439F70F">
-                  <wp:extent cx="687545" cy="1057762"/>
-                  <wp:effectExtent l="0" t="0" r="0" b="0"/>
-                  <wp:docPr id="930326401" name="Picture 1"/>
+                <wp:inline distT="0" distB="0" distL="0" distR="0" wp14:anchorId="277EC2D7" wp14:editId="587FBE39">
+                  <wp:extent cx="687545" cy="834719"/>
+                  <wp:effectExtent l="0" t="0" r="0" b="3810"/>
+                  <wp:docPr id="930326401" name="Picture 1" descr="Blank wood plaque"/>
                   <wp:cNvGraphicFramePr>
                     <a:graphicFrameLocks xmlns:a="http://schemas.openxmlformats.org/drawingml/2006/main" noChangeAspect="1"/>
                   </wp:cNvGraphicFramePr>
@@ -4108,7 +4130,7 @@
                     <a:graphicData uri="http://schemas.openxmlformats.org/drawingml/2006/picture">
                       <pic:pic xmlns:pic="http://schemas.openxmlformats.org/drawingml/2006/picture">
                         <pic:nvPicPr>
-                          <pic:cNvPr id="930326401" name="Picture 1"/>
+                          <pic:cNvPr id="930326401" name="Picture 1" descr="Blank wood plaque"/>
                           <pic:cNvPicPr/>
                         </pic:nvPicPr>
                         <pic:blipFill>
@@ -4126,7 +4148,7 @@
                         <pic:spPr>
                           <a:xfrm>
                             <a:off x="0" y="0"/>
-                            <a:ext cx="687545" cy="1057762"/>
+                            <a:ext cx="687545" cy="834719"/>
                           </a:xfrm>
                           <a:prstGeom prst="rect">
                             <a:avLst/>
@@ -5208,7 +5230,29 @@
           <w:sz w:val="24"/>
           <w:szCs w:val="24"/>
         </w:rPr>
-        <w:t>, there is now being possessed or concealed certain property or things described as:</w:t>
+        <w:t xml:space="preserve">, there is now </w:t>
+      </w:r>
+      <w:proofErr w:type="gramStart"/>
+      <w:r>
+        <w:rPr>
+          <w:rFonts w:ascii="Times New Roman" w:hAnsi="Times New Roman" w:cs="Times New Roman"/>
+          <w:b/>
+          <w:bCs/>
+          <w:sz w:val="24"/>
+          <w:szCs w:val="24"/>
+        </w:rPr>
+        <w:t>being possessed</w:t>
+      </w:r>
+      <w:proofErr w:type="gramEnd"/>
+      <w:r>
+        <w:rPr>
+          <w:rFonts w:ascii="Times New Roman" w:hAnsi="Times New Roman" w:cs="Times New Roman"/>
+          <w:b/>
+          <w:bCs/>
+          <w:sz w:val="24"/>
+          <w:szCs w:val="24"/>
+        </w:rPr>
+        <w:t xml:space="preserve"> or concealed certain property or things described as:</w:t>
       </w:r>
     </w:p>
     <w:p>
@@ -6543,6 +6587,7 @@
         <w:docPartUnique/>
       </w:docPartObj>
     </w:sdtPr>
+    <w:sdtEndPr/>
     <w:sdtContent>
       <w:sdt>
         <w:sdtPr>
@@ -6552,6 +6597,7 @@
             <w:docPartUnique/>
           </w:docPartObj>
         </w:sdtPr>
+        <w:sdtEndPr/>
         <w:sdtContent>
           <w:p>
             <w:pPr>
@@ -6675,6 +6721,7 @@
         <w:docPartUnique/>
       </w:docPartObj>
     </w:sdtPr>
+    <w:sdtEndPr/>
     <w:sdtContent>
       <w:sdt>
         <w:sdtPr>
@@ -6684,6 +6731,7 @@
             <w:docPartUnique/>
           </w:docPartObj>
         </w:sdtPr>
+        <w:sdtEndPr/>
         <w:sdtContent>
           <w:p>
             <w:pPr>

</xml_diff>